<commit_message>
fix: correct payment FAQ answers — AlwaysReady holds no card data (#305)
Q: How do I update my payment details?
- Removed false claim about Account section; direct to support@ for Stripe link

Q: What happens if a payment fails?
- Removed false claim about updating card in Account; direct to support@

Both fixes applied to FAQ docx and support desk bot system prompt.
</commit_message>
<xml_diff>
--- a/docs/AlwaysReady-FAQ.docx
+++ b/docs/AlwaysReady-FAQ.docx
@@ -2505,7 +2505,7 @@
           <w:sz w:val="20"/>
           <w:szCs w:val="20"/>
         </w:rPr>
-        <w:t xml:space="preserve">A: You can update your payment details at any time in the Account section of your dashboard.</w:t>
+        <w:t xml:space="preserve">A: Payment details are managed securely by our payment provider, Stripe. AlwaysReady does not hold any card or financial data. To update your billing details, please contact support@alwaysready.uk and we will send you a secure link.</w:t>
       </w:r>
     </w:p>
     <w:p>
@@ -2533,7 +2533,7 @@
           <w:sz w:val="20"/>
           <w:szCs w:val="20"/>
         </w:rPr>
-        <w:t xml:space="preserve">A: If a payment fails, you will be notified by email. You can update your payment details in the Account section. If the payment cannot be collected, access to the platform may be suspended until the issue is resolved.</w:t>
+        <w:t xml:space="preserve">A: If a payment fails, you will be notified by email. To resolve it, please contact us at support@alwaysready.uk and we will help you update your billing details via our payment provider. If the payment cannot be collected, access to the platform may be suspended until the issue is resolved.</w:t>
       </w:r>
     </w:p>
     <w:p>

</xml_diff>

<commit_message>
fix: correct payment FAQ — customers self-serve via Stripe portal (#306)
Both FAQ Q&As now correctly describe the Manage subscription button
in Account > Billing, which opens the Stripe portal for self-service
payment method updates. AlwaysReady holds no card data.
</commit_message>
<xml_diff>
--- a/docs/AlwaysReady-FAQ.docx
+++ b/docs/AlwaysReady-FAQ.docx
@@ -2505,7 +2505,7 @@
           <w:sz w:val="20"/>
           <w:szCs w:val="20"/>
         </w:rPr>
-        <w:t xml:space="preserve">A: Payment details are managed securely by our payment provider, Stripe. AlwaysReady does not hold any card or financial data. To update your billing details, please contact support@alwaysready.uk and we will send you a secure link.</w:t>
+        <w:t xml:space="preserve">A: Go to Account &gt; Billing and click "Manage subscription". This opens the Stripe billing portal, where you can update your payment method, view invoices, and manage your subscription. AlwaysReady does not hold any card or financial data — everything is handled securely by Stripe.</w:t>
       </w:r>
     </w:p>
     <w:p>
@@ -2533,7 +2533,7 @@
           <w:sz w:val="20"/>
           <w:szCs w:val="20"/>
         </w:rPr>
-        <w:t xml:space="preserve">A: If a payment fails, you will be notified by email. To resolve it, please contact us at support@alwaysready.uk and we will help you update your billing details via our payment provider. If the payment cannot be collected, access to the platform may be suspended until the issue is resolved.</w:t>
+        <w:t xml:space="preserve">A: If a payment fails, you will be notified by email. Go to Account &gt; Billing and click "Manage subscription" to update your payment method via the Stripe billing portal. If the payment cannot be collected, access to the platform may be suspended until the issue is resolved.</w:t>
       </w:r>
     </w:p>
     <w:p>

</xml_diff>